<commit_message>
Semaine 2 - Etape 1 : imputation, IQR et recontextualisation camerounaise
- script/notebook 05_traitement_valeurs : imputation (mediane/mode),
  traitement des valeurs aberrantes par IQR (capping)
- duree_mois regeneree (tranches realistes par objet_pret x montant,
  remplace le profil hypothecaire americain a 360 mois/30 ans herite
  du dataset source, qui rendait aussi l'IQR degeneree sur la colonne)
- plancher de plausibilite a 15000 FCFA/mois sur revenu_mensuel_fcfa
- type_pret relabellisee (Banque/Microfinance/Cooperative_epargne_credit)
- tranche_age regeneree avec une distribution active camerounaise,
  puis reclassee en variable descriptive (perte de signal assumee)
- plan et classification des variables mis a jour en consequence
</commit_message>
<xml_diff>
--- a/docs/Analyse_et_Plan_Projet.docx
+++ b/docs/Analyse_et_Plan_Projet.docx
@@ -1961,6 +1961,44 @@
       </w:pPr>
       <w:r>
         <w:t>Décision (Claude, validée par Aristide) : taux_interet et frais_initiaux_fcfa sont tous deux exclus des features du modèle, par cohérence avec le principe posé en section 4 (une variable n'est une feature valide que si elle est réellement connaissable au moment de la demande, avant toute décision d'octroi). taux_interet était déjà exclu dans le tableau de la section 4.3 ; frais_initiaux_fcfa y est ajouté ce jour, car le dictionnaire de données de Marie-Thérèse le gardait par erreur comme feature ML tout en documentant elle-même qu'il est «généralement fixé après octroi, pas à l'entrée» — un décalage entraînement/production classique (le modèle apprendrait sur une information qu'il n'aura jamais en usage réel). Les deux variables restent disponibles dans les données historiques pour analyse, mais ne font pas partie de la liste de features validée en Semaine 2.</w:t>
+      </w:r>
+    </w:p>
+    <w:p>
+      <w:pPr>
+        <w:pStyle w:val="Heading2"/>
+      </w:pPr>
+      <w:r>
+        <w:t>4.7 Points tranchés le 04 août 2026 (Semaine 2)</w:t>
+      </w:r>
+    </w:p>
+    <w:p>
+      <w:pPr/>
+      <w:r>
+        <w:t>Décisions prises par Aristide (avec l'aide de Claude) pendant la tâche de traitement des valeurs manquantes et aberrantes (lundi 3 - mardi 4 août 2026, script scripts/05_traitement_valeurs.py), en réouverture assumée de points par ailleurs tranchés le 29-31 juillet - même logique que pour region_cameroun le 31 juillet : une donnée trompeuse ou irréaliste est corrigée avant la modélisation plutôt que laissée telle quelle par simple respect d'une décision antérieure.</w:t>
+      </w:r>
+    </w:p>
+    <w:p>
+      <w:pPr/>
+      <w:r>
+        <w:t>1) duree_mois régénérée entièrement (tranches réalistes camerounaises par objet_pret x montant_pret_fcfa, 3 à 60 mois selon le cas) : la distribution héritée du dataset source (360 mois sur 81,8% des lignes, terme hypothécaire américain standard) ne correspondait à aucune réalité de crédit général/microfinance au Cameroun et rendait de plus la méthode IQR dégénérée sur cette colonne (Q1 = Q3 = 360). Réouvre le point de la section 4.5 (« duree_mois conservée telle quelle »).</w:t>
+      </w:r>
+    </w:p>
+    <w:p>
+      <w:pPr/>
+      <w:r>
+        <w:t>2) revenu_mensuel_fcfa : plancher de plausibilité fixé à 15 000 FCFA/mois (228 lignes concernées, revenu jugé non plausible pour solliciter un crédit), distinct du capping statistique IQR déjà appliqué sur cette colonne.</w:t>
+      </w:r>
+    </w:p>
+    <w:p>
+      <w:pPr/>
+      <w:r>
+        <w:t>3) type_pret relabellisée : Type_1/2/3 (codes anonymisés sans équivalent camerounais, déjà signalés comme limitation en section 2.4) deviennent Banque / Microfinance / Cooperative_epargne_credit. Renommage pur, aucune valeur déplacée : rattache un signal réel (22,8%/34,5%/25,1% de défaut) au périmètre banques + microfinance du projet (section 1), cohérent avec l'ordre de risque observé (microfinance &gt; coopérative &gt; banque).</w:t>
+      </w:r>
+    </w:p>
+    <w:p>
+      <w:pPr/>
+      <w:r>
+        <w:t>4) tranche_age régénérée avec une distribution active camerounaise (25-44 ans : 57% au lieu de 35% dans le dataset source, hérité d'un profil de refinancement hypothécaire américain vieillissant), tirée indépendamment de toute autre colonne pour ne pas fabriquer de corrélation avec la cible. Conséquence assumée : le taux de défaut devient plat sur toutes les tranches (24,0-25,1%, vérifié) - tranche_age est donc reclassée de feature ML à variable descriptive uniquement (comme niveau_education). Mise à jour correspondante dans Classification_Variables_Consolidee.txt.</w:t>
       </w:r>
     </w:p>
     <w:p>

</xml_diff>